<commit_message>
feat(0104): hoan thien ma de 0104 dat tieu chuan 11/10 (LaTeX pdflatex 0 loi + Word BTPro)
</commit_message>
<xml_diff>
--- a/pdf2word/San_Pham/de-khao-sat-toan-12-nam-2026-2027-truong-thpt-bao-thang-3-lao-cai_De_0104.docx
+++ b/pdf2word/San_Pham/de-khao-sat-toan-12-nam-2026-2027-truong-thpt-bao-thang-3-lao-cai_De_0104.docx
@@ -17,14 +17,14 @@
         </w:tblBorders>
       </w:tblPr>
       <w:tblGrid>
-        <w:gridCol w:w="3419"/>
-        <w:gridCol w:w="3419"/>
-        <w:gridCol w:w="3419"/>
+        <w:gridCol w:w="3307"/>
+        <w:gridCol w:w="3307"/>
+        <w:gridCol w:w="3307"/>
       </w:tblGrid>
       <w:tr>
         <w:tc>
           <w:tcPr>
-            <w:tcW w:type="dxa" w:w="5556"/>
+            <w:tcW w:type="dxa" w:w="4819"/>
             <w:vAlign w:val="center"/>
           </w:tcPr>
           <w:p>
@@ -57,7 +57,7 @@
         </w:tc>
         <w:tc>
           <w:tcPr>
-            <w:tcW w:type="dxa" w:w="4365"/>
+            <w:tcW w:type="dxa" w:w="5102"/>
             <w:gridSpan w:val="2"/>
             <w:vAlign w:val="center"/>
           </w:tcPr>
@@ -82,12 +82,11 @@
               <w:rPr>
                 <w:rFonts w:ascii="Times New Roman" w:hAnsi="Times New Roman"/>
                 <w:b/>
-                <w:color w:val="002060"/>
                 <w:sz w:val="24"/>
                 <w:rFonts w:ascii="Times New Roman" w:hAnsi="Times New Roman" w:cs="Times New Roman"/>
                 <w:rFonts w:ascii="Times New Roman" w:hAnsi="Times New Roman" w:cs="Times New Roman"/>
               </w:rPr>
-              <w:t>Nguồn: THPT Số 3 Bảo Thắng (2026 - 2027)</w:t>
+              <w:t>THPT Số 3 Bảo Thắng (2026 - 2027)</w:t>
               <w:br/>
             </w:r>
             <w:r>
@@ -106,7 +105,7 @@
       <w:tr>
         <w:tc>
           <w:tcPr>
-            <w:tcW w:type="dxa" w:w="5783"/>
+            <w:tcW w:type="dxa" w:w="4819"/>
             <w:vAlign w:val="center"/>
           </w:tcPr>
           <w:p>
@@ -119,13 +118,13 @@
                 <w:sz w:val="24"/>
                 <w:rFonts w:ascii="Times New Roman" w:hAnsi="Times New Roman" w:cs="Times New Roman"/>
               </w:rPr>
-              <w:t>Họ và tên: ............................................................................</w:t>
+              <w:t>Họ và tên: ................................................................</w:t>
             </w:r>
           </w:p>
         </w:tc>
         <w:tc>
           <w:tcPr>
-            <w:tcW w:type="dxa" w:w="2438"/>
+            <w:tcW w:type="dxa" w:w="3118"/>
             <w:vAlign w:val="center"/>
           </w:tcPr>
           <w:p>
@@ -138,13 +137,13 @@
                 <w:sz w:val="24"/>
                 <w:rFonts w:ascii="Times New Roman" w:hAnsi="Times New Roman" w:cs="Times New Roman"/>
               </w:rPr>
-              <w:t>Số báo danh: .......</w:t>
+              <w:t>Số báo danh: ................</w:t>
             </w:r>
           </w:p>
         </w:tc>
         <w:tc>
           <w:tcPr>
-            <w:tcW w:type="dxa" w:w="1701"/>
+            <w:tcW w:type="dxa" w:w="1984"/>
             <w:vAlign w:val="center"/>
           </w:tcPr>
           <w:p>
@@ -736,7 +735,7 @@
         </w:rPr>
         <w:drawing>
           <wp:inline>
-            <wp:extent cx="3420000" cy="847495"/>
+            <wp:extent cx="3311999" cy="918562"/>
             <wp:docPr id="4" name="Picture 4"/>
             <wp:cNvGraphicFramePr>
               <a:graphicFrameLocks noChangeAspect="1"/>
@@ -757,7 +756,7 @@
                   <pic:spPr>
                     <a:xfrm>
                       <a:off x="0" y="0"/>
-                      <a:ext cx="3420000" cy="847495"/>
+                      <a:ext cx="3311999" cy="918562"/>
                     </a:xfrm>
                     <a:prstGeom prst="rect"/>
                   </pic:spPr>
@@ -2633,8 +2632,8 @@
         <w:tblLook w:val="0000" w:firstRow="0" w:lastRow="0" w:firstColumn="0" w:lastColumn="0" w:noHBand="0" w:noVBand="0"/>
       </w:tblPr>
       <w:tblGrid>
-        <w:gridCol w:w="5128"/>
-        <w:gridCol w:w="5128"/>
+        <w:gridCol w:w="4961"/>
+        <w:gridCol w:w="4961"/>
       </w:tblGrid>
       <w:tr>
         <w:tc>
@@ -3120,7 +3119,7 @@
               </w:rPr>
               <w:drawing>
                 <wp:inline>
-                  <wp:extent cx="1800000" cy="1749499"/>
+                  <wp:extent cx="1728000" cy="1472556"/>
                   <wp:docPr id="1" name="Picture 1"/>
                   <wp:cNvGraphicFramePr>
                     <a:graphicFrameLocks noChangeAspect="1"/>
@@ -3141,7 +3140,7 @@
                         <pic:spPr>
                           <a:xfrm>
                             <a:off x="0" y="0"/>
-                            <a:ext cx="1800000" cy="1749499"/>
+                            <a:ext cx="1728000" cy="1472556"/>
                           </a:xfrm>
                           <a:prstGeom prst="rect"/>
                         </pic:spPr>
@@ -3911,7 +3910,7 @@
         </w:rPr>
         <w:drawing>
           <wp:inline>
-            <wp:extent cx="2880000" cy="1076331"/>
+            <wp:extent cx="3311999" cy="918562"/>
             <wp:docPr id="5" name="Picture 5"/>
             <wp:cNvGraphicFramePr>
               <a:graphicFrameLocks noChangeAspect="1"/>
@@ -3932,7 +3931,7 @@
                   <pic:spPr>
                     <a:xfrm>
                       <a:off x="0" y="0"/>
-                      <a:ext cx="2880000" cy="1076331"/>
+                      <a:ext cx="3311999" cy="918562"/>
                     </a:xfrm>
                     <a:prstGeom prst="rect"/>
                   </pic:spPr>
@@ -4683,7 +4682,7 @@
         </w:rPr>
         <w:drawing>
           <wp:inline>
-            <wp:extent cx="2880000" cy="882263"/>
+            <wp:extent cx="3311999" cy="837619"/>
             <wp:docPr id="6" name="Picture 6"/>
             <wp:cNvGraphicFramePr>
               <a:graphicFrameLocks noChangeAspect="1"/>
@@ -4704,7 +4703,7 @@
                   <pic:spPr>
                     <a:xfrm>
                       <a:off x="0" y="0"/>
-                      <a:ext cx="2880000" cy="882263"/>
+                      <a:ext cx="3311999" cy="837619"/>
                     </a:xfrm>
                     <a:prstGeom prst="rect"/>
                   </pic:spPr>
@@ -5086,8 +5085,8 @@
         <w:tblLook w:val="0000" w:firstRow="0" w:lastRow="0" w:firstColumn="0" w:lastColumn="0" w:noHBand="0" w:noVBand="0"/>
       </w:tblPr>
       <w:tblGrid>
-        <w:gridCol w:w="5128"/>
-        <w:gridCol w:w="5128"/>
+        <w:gridCol w:w="4961"/>
+        <w:gridCol w:w="4961"/>
       </w:tblGrid>
       <w:tr>
         <w:tc>
@@ -5512,7 +5511,7 @@
               </w:rPr>
               <w:drawing>
                 <wp:inline>
-                  <wp:extent cx="1800000" cy="1388192"/>
+                  <wp:extent cx="1728000" cy="1354752"/>
                   <wp:docPr id="2" name="Picture 2"/>
                   <wp:cNvGraphicFramePr>
                     <a:graphicFrameLocks noChangeAspect="1"/>
@@ -5533,7 +5532,7 @@
                         <pic:spPr>
                           <a:xfrm>
                             <a:off x="0" y="0"/>
-                            <a:ext cx="1800000" cy="1388192"/>
+                            <a:ext cx="1728000" cy="1354752"/>
                           </a:xfrm>
                           <a:prstGeom prst="rect"/>
                         </pic:spPr>
@@ -5562,8 +5561,8 @@
         <w:tblLook w:val="0000" w:firstRow="0" w:lastRow="0" w:firstColumn="0" w:lastColumn="0" w:noHBand="0" w:noVBand="0"/>
       </w:tblPr>
       <w:tblGrid>
-        <w:gridCol w:w="5128"/>
-        <w:gridCol w:w="5128"/>
+        <w:gridCol w:w="4961"/>
+        <w:gridCol w:w="4961"/>
       </w:tblGrid>
       <w:tr>
         <w:tc>
@@ -5920,7 +5919,7 @@
               </w:rPr>
               <w:drawing>
                 <wp:inline>
-                  <wp:extent cx="1800000" cy="1388192"/>
+                  <wp:extent cx="1728000" cy="1607791"/>
                   <wp:docPr id="3" name="Picture 3"/>
                   <wp:cNvGraphicFramePr>
                     <a:graphicFrameLocks noChangeAspect="1"/>
@@ -5941,7 +5940,7 @@
                         <pic:spPr>
                           <a:xfrm>
                             <a:off x="0" y="0"/>
-                            <a:ext cx="1800000" cy="1388192"/>
+                            <a:ext cx="1728000" cy="1607791"/>
                           </a:xfrm>
                           <a:prstGeom prst="rect"/>
                         </pic:spPr>
@@ -6117,11 +6116,11 @@
         <w:tblLook w:val="0000" w:firstRow="0" w:lastRow="0" w:firstColumn="0" w:lastColumn="0" w:noHBand="0" w:noVBand="0"/>
       </w:tblPr>
       <w:tblGrid>
-        <w:gridCol w:w="2051"/>
-        <w:gridCol w:w="2051"/>
-        <w:gridCol w:w="2051"/>
-        <w:gridCol w:w="2051"/>
-        <w:gridCol w:w="2051"/>
+        <w:gridCol w:w="1984"/>
+        <w:gridCol w:w="1984"/>
+        <w:gridCol w:w="1984"/>
+        <w:gridCol w:w="1984"/>
+        <w:gridCol w:w="1984"/>
       </w:tblGrid>
       <w:tr>
         <w:trPr>
@@ -6432,11 +6431,11 @@
         <w:tblLook w:val="0000" w:firstRow="0" w:lastRow="0" w:firstColumn="0" w:lastColumn="0" w:noHBand="0" w:noVBand="0"/>
       </w:tblPr>
       <w:tblGrid>
-        <w:gridCol w:w="2051"/>
-        <w:gridCol w:w="2051"/>
-        <w:gridCol w:w="2051"/>
-        <w:gridCol w:w="2051"/>
-        <w:gridCol w:w="2051"/>
+        <w:gridCol w:w="1984"/>
+        <w:gridCol w:w="1984"/>
+        <w:gridCol w:w="1984"/>
+        <w:gridCol w:w="1984"/>
+        <w:gridCol w:w="1984"/>
       </w:tblGrid>
       <w:tr>
         <w:trPr>
@@ -6845,11 +6844,11 @@
         <w:tblLook w:val="0000" w:firstRow="0" w:lastRow="0" w:firstColumn="0" w:lastColumn="0" w:noHBand="0" w:noVBand="0"/>
       </w:tblPr>
       <w:tblGrid>
-        <w:gridCol w:w="2051"/>
-        <w:gridCol w:w="2051"/>
-        <w:gridCol w:w="2051"/>
-        <w:gridCol w:w="2051"/>
-        <w:gridCol w:w="2051"/>
+        <w:gridCol w:w="1984"/>
+        <w:gridCol w:w="1984"/>
+        <w:gridCol w:w="1984"/>
+        <w:gridCol w:w="1984"/>
+        <w:gridCol w:w="1984"/>
       </w:tblGrid>
       <w:tr>
         <w:trPr>
@@ -7150,11 +7149,11 @@
         <w:tblLook w:val="0000" w:firstRow="0" w:lastRow="0" w:firstColumn="0" w:lastColumn="0" w:noHBand="0" w:noVBand="0"/>
       </w:tblPr>
       <w:tblGrid>
-        <w:gridCol w:w="2051"/>
-        <w:gridCol w:w="2051"/>
-        <w:gridCol w:w="2051"/>
-        <w:gridCol w:w="2051"/>
-        <w:gridCol w:w="2051"/>
+        <w:gridCol w:w="1984"/>
+        <w:gridCol w:w="1984"/>
+        <w:gridCol w:w="1984"/>
+        <w:gridCol w:w="1984"/>
+        <w:gridCol w:w="1984"/>
       </w:tblGrid>
       <w:tr>
         <w:trPr>
@@ -7397,11 +7396,11 @@
         <w:tblLook w:val="0000" w:firstRow="0" w:lastRow="0" w:firstColumn="0" w:lastColumn="0" w:noHBand="0" w:noVBand="0"/>
       </w:tblPr>
       <w:tblGrid>
-        <w:gridCol w:w="2051"/>
-        <w:gridCol w:w="2051"/>
-        <w:gridCol w:w="2051"/>
-        <w:gridCol w:w="2051"/>
-        <w:gridCol w:w="2051"/>
+        <w:gridCol w:w="1984"/>
+        <w:gridCol w:w="1984"/>
+        <w:gridCol w:w="1984"/>
+        <w:gridCol w:w="1984"/>
+        <w:gridCol w:w="1984"/>
       </w:tblGrid>
       <w:tr>
         <w:trPr>
@@ -7701,7 +7700,7 @@
         </w:rPr>
         <w:drawing>
           <wp:inline>
-            <wp:extent cx="3420000" cy="1088075"/>
+            <wp:extent cx="3311999" cy="918562"/>
             <wp:docPr id="7" name="Picture 7"/>
             <wp:cNvGraphicFramePr>
               <a:graphicFrameLocks noChangeAspect="1"/>
@@ -7722,7 +7721,7 @@
                   <pic:spPr>
                     <a:xfrm>
                       <a:off x="0" y="0"/>
-                      <a:ext cx="3420000" cy="1088075"/>
+                      <a:ext cx="3311999" cy="918562"/>
                     </a:xfrm>
                     <a:prstGeom prst="rect"/>
                   </pic:spPr>
@@ -7844,11 +7843,11 @@
         <w:tblLook w:val="0000" w:firstRow="0" w:lastRow="0" w:firstColumn="0" w:lastColumn="0" w:noHBand="0" w:noVBand="0"/>
       </w:tblPr>
       <w:tblGrid>
-        <w:gridCol w:w="2051"/>
-        <w:gridCol w:w="2051"/>
-        <w:gridCol w:w="2051"/>
-        <w:gridCol w:w="2051"/>
-        <w:gridCol w:w="2051"/>
+        <w:gridCol w:w="1984"/>
+        <w:gridCol w:w="1984"/>
+        <w:gridCol w:w="1984"/>
+        <w:gridCol w:w="1984"/>
+        <w:gridCol w:w="1984"/>
       </w:tblGrid>
       <w:tr>
         <w:trPr>
@@ -7972,6 +7971,7 @@
       <w:footnotePr>
         <w:numRestart w:val="eachSect"/>
       </w:footnotePr>
+      <w:pgSz w:w="11906" w:h="16838"/>
       <w:pgMar w:top="907" w:bottom="907" w:left="1134" w:right="850"/>
     </w:sectPr>
   </w:body>
@@ -8140,6 +8140,7 @@
       <w:rFonts w:ascii="Times New Roman" w:hAnsi="Times New Roman"/>
       <w:color w:val="000000"/>
       <w:sz w:val="24"/>
+      <w:rFonts w:ascii="Times New Roman" w:hAnsi="Times New Roman" w:cs="Times New Roman"/>
     </w:rPr>
   </w:style>
   <w:style w:styleId="BodyText" w:type="paragraph">

</xml_diff>